<commit_message>
release(officialZ): archive the official MetaXcan Z recompute layer
</commit_message>
<xml_diff>
--- a/tables/SuppTableS5.docx
+++ b/tables/SuppTableS5.docx
@@ -1558,7 +1558,7 @@
               <w:rPr>
                 <w:sz w:val="18"/>
               </w:rPr>
-              <w:t>+10.28</w:t>
+              <w:t>+9.88</w:t>
             </w:r>
           </w:p>
         </w:tc>
@@ -1578,7 +1578,7 @@
               <w:rPr>
                 <w:sz w:val="18"/>
               </w:rPr>
-              <w:t>8.9e-25</w:t>
+              <w:t>5.1e-23</w:t>
             </w:r>
           </w:p>
         </w:tc>
@@ -1618,7 +1618,7 @@
               <w:rPr>
                 <w:sz w:val="18"/>
               </w:rPr>
-              <w:t>Weighted Stouffer, weights √(N_e,i); Q = 72.7, I² = 98.6% (m6_ne_weighted_sensitivity.py)</w:t>
+              <w:t>Weighted Stouffer, weights √(N_e,i); Q = 80.7, I² = 98.8% (m6_ne_weighted_sensitivity.py)</w:t>
             </w:r>
           </w:p>
         </w:tc>
@@ -1844,7 +1844,7 @@
               <w:rPr>
                 <w:sz w:val="18"/>
               </w:rPr>
-              <w:t>+10.28</w:t>
+              <w:t>+9.88</w:t>
             </w:r>
           </w:p>
         </w:tc>
@@ -1864,7 +1864,7 @@
               <w:rPr>
                 <w:sz w:val="18"/>
               </w:rPr>
-              <w:t>8.6e-25</w:t>
+              <w:t>5.0e-23</w:t>
             </w:r>
           </w:p>
         </w:tc>
@@ -1904,7 +1904,7 @@
               <w:rPr>
                 <w:sz w:val="18"/>
               </w:rPr>
-              <w:t>Q = 72.9, I² = 97.3%; mixes weight sources; completeness only</w:t>
+              <w:t>Q = 80.9, I² = 97.5%; mixes weight sources; completeness only</w:t>
             </w:r>
           </w:p>
         </w:tc>

</xml_diff>